<commit_message>
Set line spacing back to 1.5
Body, headings, lists and the reference list all return to the
document's original 1.5 spacing; Normal style updated to match.

Co-Authored-By: Claude Opus 5 <noreply@anthropic.com>
Claude-Session: https://claude.ai/code/session_01DwryMW8mt6PFkikMAku3sm
</commit_message>
<xml_diff>
--- a/main document-revised-4 eylul.docx
+++ b/main document-revised-4 eylul.docx
@@ -680,7 +680,7 @@
     <w:p>
       <w:pPr>
         <w:widowControl/>
-        <w:spacing w:line="480" w:lineRule="auto" w:before="240" w:after="120"/>
+        <w:spacing w:line="360" w:lineRule="auto" w:before="240" w:after="120"/>
         <w:jc w:val="left"/>
         <w:rPr>
           <w:rFonts w:ascii="Times New Roman" w:hAnsi="Times New Roman"/>
@@ -707,7 +707,7 @@
     <w:p>
       <w:pPr>
         <w:widowControl/>
-        <w:spacing w:line="480" w:lineRule="auto" w:before="0" w:after="120"/>
+        <w:spacing w:line="360" w:lineRule="auto" w:before="0" w:after="120"/>
         <w:jc w:val="both"/>
         <w:rPr>
           <w:rFonts w:ascii="Times New Roman" w:hAnsi="Times New Roman"/>
@@ -737,7 +737,7 @@
     <w:p>
       <w:pPr>
         <w:widowControl/>
-        <w:spacing w:line="480" w:lineRule="auto" w:before="0" w:after="120"/>
+        <w:spacing w:line="360" w:lineRule="auto" w:before="0" w:after="120"/>
         <w:jc w:val="both"/>
         <w:rPr>
           <w:rFonts w:ascii="Times New Roman" w:hAnsi="Times New Roman"/>
@@ -783,7 +783,7 @@
     <w:p>
       <w:pPr>
         <w:widowControl/>
-        <w:spacing w:line="480" w:lineRule="auto" w:before="0" w:after="120"/>
+        <w:spacing w:line="360" w:lineRule="auto" w:before="0" w:after="120"/>
         <w:jc w:val="both"/>
         <w:rPr>
           <w:rFonts w:ascii="Times New Roman" w:hAnsi="Times New Roman"/>
@@ -869,7 +869,7 @@
     <w:p>
       <w:pPr>
         <w:widowControl/>
-        <w:spacing w:line="480" w:lineRule="auto" w:before="0" w:after="120"/>
+        <w:spacing w:line="360" w:lineRule="auto" w:before="0" w:after="120"/>
         <w:jc w:val="both"/>
         <w:rPr>
           <w:rFonts w:ascii="Times New Roman" w:hAnsi="Times New Roman"/>
@@ -899,7 +899,7 @@
     <w:p>
       <w:pPr>
         <w:widowControl/>
-        <w:spacing w:line="480" w:lineRule="auto" w:before="0" w:after="120"/>
+        <w:spacing w:line="360" w:lineRule="auto" w:before="0" w:after="120"/>
         <w:jc w:val="both"/>
         <w:rPr>
           <w:rFonts w:ascii="Times New Roman" w:hAnsi="Times New Roman"/>
@@ -930,7 +930,7 @@
     <w:p>
       <w:pPr>
         <w:widowControl/>
-        <w:spacing w:line="480" w:lineRule="auto" w:before="240" w:after="120"/>
+        <w:spacing w:line="360" w:lineRule="auto" w:before="240" w:after="120"/>
         <w:jc w:val="left"/>
         <w:rPr>
           <w:rFonts w:ascii="Times New Roman" w:hAnsi="Times New Roman"/>
@@ -957,7 +957,7 @@
     <w:p>
       <w:pPr>
         <w:widowControl/>
-        <w:spacing w:line="480" w:lineRule="auto" w:before="0" w:after="0"/>
+        <w:spacing w:line="360" w:lineRule="auto" w:before="0" w:after="0"/>
         <w:jc w:val="both"/>
         <w:rPr>
           <w:rFonts w:ascii="Times New Roman" w:hAnsi="Times New Roman"/>
@@ -1538,7 +1538,7 @@
     <w:p>
       <w:pPr>
         <w:widowControl/>
-        <w:spacing w:line="480" w:lineRule="auto" w:before="0" w:after="0"/>
+        <w:spacing w:line="360" w:lineRule="auto" w:before="0" w:after="0"/>
         <w:jc w:val="both"/>
         <w:rPr>
           <w:rFonts w:ascii="Times New Roman" w:hAnsi="Times New Roman"/>
@@ -1562,7 +1562,7 @@
     <w:p>
       <w:pPr>
         <w:widowControl/>
-        <w:spacing w:line="480" w:lineRule="auto" w:before="0" w:after="0"/>
+        <w:spacing w:line="360" w:lineRule="auto" w:before="0" w:after="0"/>
         <w:jc w:val="both"/>
         <w:rPr>
           <w:rFonts w:ascii="Times New Roman" w:hAnsi="Times New Roman"/>
@@ -2149,7 +2149,7 @@
     <w:p>
       <w:pPr>
         <w:widowControl/>
-        <w:spacing w:line="480" w:lineRule="auto" w:before="0" w:after="0"/>
+        <w:spacing w:line="360" w:lineRule="auto" w:before="0" w:after="0"/>
         <w:jc w:val="both"/>
         <w:rPr>
           <w:rFonts w:ascii="Times New Roman" w:hAnsi="Times New Roman"/>
@@ -2385,7 +2385,7 @@
     <w:p>
       <w:pPr>
         <w:widowControl/>
-        <w:spacing w:line="480" w:lineRule="auto" w:before="200" w:after="80"/>
+        <w:spacing w:line="360" w:lineRule="auto" w:before="200" w:after="80"/>
         <w:jc w:val="left"/>
         <w:rPr>
           <w:rFonts w:ascii="Times New Roman" w:hAnsi="Times New Roman"/>
@@ -2414,7 +2414,7 @@
     <w:p>
       <w:pPr>
         <w:widowControl/>
-        <w:spacing w:line="480" w:lineRule="auto" w:before="120" w:after="0"/>
+        <w:spacing w:line="360" w:lineRule="auto" w:before="120" w:after="0"/>
         <w:jc w:val="both"/>
         <w:rPr>
           <w:rFonts w:ascii="Times New Roman" w:hAnsi="Times New Roman"/>
@@ -2443,7 +2443,7 @@
           <w:ilvl w:val="0"/>
           <w:numId w:val="2"/>
         </w:numPr>
-        <w:spacing w:line="480" w:lineRule="auto" w:before="0" w:after="0"/>
+        <w:spacing w:line="360" w:lineRule="auto" w:before="0" w:after="0"/>
         <w:ind w:left="720" w:hanging="360"/>
         <w:jc w:val="both"/>
         <w:rPr>
@@ -2514,7 +2514,7 @@
           <w:ilvl w:val="0"/>
           <w:numId w:val="2"/>
         </w:numPr>
-        <w:spacing w:line="480" w:lineRule="auto" w:before="0" w:after="0"/>
+        <w:spacing w:line="360" w:lineRule="auto" w:before="0" w:after="0"/>
         <w:ind w:left="720" w:hanging="360"/>
         <w:jc w:val="both"/>
         <w:rPr>
@@ -2565,7 +2565,7 @@
           <w:ilvl w:val="0"/>
           <w:numId w:val="2"/>
         </w:numPr>
-        <w:spacing w:line="480" w:lineRule="auto" w:before="0" w:after="0"/>
+        <w:spacing w:line="360" w:lineRule="auto" w:before="0" w:after="0"/>
         <w:ind w:left="720" w:hanging="360"/>
         <w:jc w:val="both"/>
         <w:rPr>
@@ -2611,7 +2611,7 @@
     <w:p>
       <w:pPr>
         <w:widowControl/>
-        <w:spacing w:line="480" w:lineRule="auto" w:before="0" w:after="0"/>
+        <w:spacing w:line="360" w:lineRule="auto" w:before="0" w:after="0"/>
         <w:jc w:val="both"/>
         <w:rPr>
           <w:rFonts w:ascii="Times New Roman" w:hAnsi="Times New Roman"/>
@@ -2635,7 +2635,7 @@
     <w:p>
       <w:pPr>
         <w:widowControl/>
-        <w:spacing w:line="480" w:lineRule="auto" w:before="240" w:after="120"/>
+        <w:spacing w:line="360" w:lineRule="auto" w:before="240" w:after="120"/>
         <w:jc w:val="left"/>
         <w:rPr>
           <w:rFonts w:ascii="Times New Roman" w:hAnsi="Times New Roman"/>
@@ -2659,7 +2659,7 @@
     <w:p>
       <w:pPr>
         <w:widowControl/>
-        <w:spacing w:line="480" w:lineRule="auto" w:before="200" w:after="80"/>
+        <w:spacing w:line="360" w:lineRule="auto" w:before="200" w:after="80"/>
         <w:jc w:val="left"/>
         <w:rPr>
           <w:rFonts w:ascii="Times New Roman" w:hAnsi="Times New Roman"/>
@@ -2688,7 +2688,7 @@
     <w:p>
       <w:pPr>
         <w:widowControl/>
-        <w:spacing w:line="480" w:lineRule="auto" w:before="0" w:after="0"/>
+        <w:spacing w:line="360" w:lineRule="auto" w:before="0" w:after="0"/>
         <w:jc w:val="both"/>
         <w:rPr>
           <w:rFonts w:ascii="Times New Roman" w:hAnsi="Times New Roman"/>
@@ -2742,7 +2742,7 @@
     <w:p>
       <w:pPr>
         <w:widowControl/>
-        <w:spacing w:line="480" w:lineRule="auto" w:before="200" w:after="80"/>
+        <w:spacing w:line="360" w:lineRule="auto" w:before="200" w:after="80"/>
         <w:jc w:val="left"/>
         <w:rPr>
           <w:rFonts w:ascii="Times New Roman" w:hAnsi="Times New Roman"/>
@@ -2771,7 +2771,7 @@
     <w:p>
       <w:pPr>
         <w:widowControl/>
-        <w:spacing w:line="480" w:lineRule="auto" w:before="0" w:after="0"/>
+        <w:spacing w:line="360" w:lineRule="auto" w:before="0" w:after="0"/>
         <w:jc w:val="both"/>
         <w:rPr>
           <w:rFonts w:ascii="Times New Roman" w:hAnsi="Times New Roman"/>
@@ -2793,7 +2793,7 @@
     <w:p>
       <w:pPr>
         <w:widowControl/>
-        <w:spacing w:line="480" w:lineRule="auto" w:before="120" w:after="0"/>
+        <w:spacing w:line="360" w:lineRule="auto" w:before="120" w:after="0"/>
         <w:jc w:val="both"/>
         <w:rPr>
           <w:rFonts w:ascii="Times New Roman" w:hAnsi="Times New Roman"/>
@@ -2831,7 +2831,7 @@
           <w:ilvl w:val="0"/>
           <w:numId w:val="3"/>
         </w:numPr>
-        <w:spacing w:line="480" w:lineRule="auto" w:before="0" w:after="0"/>
+        <w:spacing w:line="360" w:lineRule="auto" w:before="0" w:after="0"/>
         <w:ind w:left="720" w:hanging="360"/>
         <w:jc w:val="both"/>
         <w:rPr>
@@ -2859,7 +2859,7 @@
           <w:ilvl w:val="0"/>
           <w:numId w:val="3"/>
         </w:numPr>
-        <w:spacing w:line="480" w:lineRule="auto" w:before="0" w:after="0"/>
+        <w:spacing w:line="360" w:lineRule="auto" w:before="0" w:after="0"/>
         <w:ind w:left="720" w:hanging="360"/>
         <w:jc w:val="both"/>
         <w:rPr>
@@ -2887,7 +2887,7 @@
           <w:ilvl w:val="0"/>
           <w:numId w:val="3"/>
         </w:numPr>
-        <w:spacing w:line="480" w:lineRule="auto" w:before="0" w:after="0"/>
+        <w:spacing w:line="360" w:lineRule="auto" w:before="0" w:after="0"/>
         <w:ind w:left="720" w:hanging="360"/>
         <w:jc w:val="both"/>
         <w:rPr>
@@ -2910,7 +2910,7 @@
     <w:p>
       <w:pPr>
         <w:widowControl/>
-        <w:spacing w:line="480" w:lineRule="auto" w:before="120" w:after="0"/>
+        <w:spacing w:line="360" w:lineRule="auto" w:before="120" w:after="0"/>
         <w:jc w:val="both"/>
         <w:rPr>
           <w:rFonts w:ascii="Times New Roman" w:hAnsi="Times New Roman"/>
@@ -2948,7 +2948,7 @@
           <w:ilvl w:val="0"/>
           <w:numId w:val="4"/>
         </w:numPr>
-        <w:spacing w:line="480" w:lineRule="auto" w:before="0" w:after="0"/>
+        <w:spacing w:line="360" w:lineRule="auto" w:before="0" w:after="0"/>
         <w:ind w:left="720" w:hanging="360"/>
         <w:jc w:val="both"/>
         <w:rPr>
@@ -2976,7 +2976,7 @@
           <w:ilvl w:val="0"/>
           <w:numId w:val="4"/>
         </w:numPr>
-        <w:spacing w:line="480" w:lineRule="auto" w:before="0" w:after="0"/>
+        <w:spacing w:line="360" w:lineRule="auto" w:before="0" w:after="0"/>
         <w:ind w:left="720" w:hanging="360"/>
         <w:jc w:val="both"/>
         <w:rPr>
@@ -3004,7 +3004,7 @@
           <w:ilvl w:val="0"/>
           <w:numId w:val="4"/>
         </w:numPr>
-        <w:spacing w:line="480" w:lineRule="auto" w:before="0" w:after="0"/>
+        <w:spacing w:line="360" w:lineRule="auto" w:before="0" w:after="0"/>
         <w:ind w:left="720" w:hanging="360"/>
         <w:jc w:val="both"/>
         <w:rPr>
@@ -3032,7 +3032,7 @@
           <w:ilvl w:val="0"/>
           <w:numId w:val="4"/>
         </w:numPr>
-        <w:spacing w:line="480" w:lineRule="auto" w:before="0" w:after="0"/>
+        <w:spacing w:line="360" w:lineRule="auto" w:before="0" w:after="0"/>
         <w:ind w:left="720" w:hanging="360"/>
         <w:jc w:val="both"/>
         <w:rPr>
@@ -3060,7 +3060,7 @@
           <w:ilvl w:val="0"/>
           <w:numId w:val="4"/>
         </w:numPr>
-        <w:spacing w:line="480" w:lineRule="auto" w:before="0" w:after="0"/>
+        <w:spacing w:line="360" w:lineRule="auto" w:before="0" w:after="0"/>
         <w:ind w:left="720" w:hanging="360"/>
         <w:jc w:val="both"/>
         <w:rPr>
@@ -3083,7 +3083,7 @@
     <w:p>
       <w:pPr>
         <w:widowControl/>
-        <w:spacing w:line="480" w:lineRule="auto" w:before="0" w:after="0"/>
+        <w:spacing w:line="360" w:lineRule="auto" w:before="0" w:after="0"/>
         <w:jc w:val="both"/>
         <w:rPr>
           <w:rFonts w:ascii="Times New Roman" w:hAnsi="Times New Roman"/>
@@ -3145,7 +3145,7 @@
     <w:p>
       <w:pPr>
         <w:widowControl/>
-        <w:spacing w:line="480" w:lineRule="auto" w:before="200" w:after="80"/>
+        <w:spacing w:line="360" w:lineRule="auto" w:before="200" w:after="80"/>
         <w:jc w:val="left"/>
         <w:rPr>
           <w:rFonts w:ascii="Times New Roman" w:hAnsi="Times New Roman"/>
@@ -3174,7 +3174,7 @@
     <w:p>
       <w:pPr>
         <w:widowControl/>
-        <w:spacing w:line="480" w:lineRule="auto" w:before="0" w:after="0"/>
+        <w:spacing w:line="360" w:lineRule="auto" w:before="0" w:after="0"/>
         <w:jc w:val="both"/>
         <w:rPr>
           <w:rFonts w:ascii="Times New Roman" w:hAnsi="Times New Roman"/>
@@ -3196,7 +3196,7 @@
     <w:p>
       <w:pPr>
         <w:widowControl/>
-        <w:spacing w:line="480" w:lineRule="auto" w:before="0" w:after="0"/>
+        <w:spacing w:line="360" w:lineRule="auto" w:before="0" w:after="0"/>
         <w:jc w:val="both"/>
         <w:rPr>
           <w:rFonts w:ascii="Times New Roman" w:hAnsi="Times New Roman"/>
@@ -3238,7 +3238,7 @@
     <w:p>
       <w:pPr>
         <w:widowControl/>
-        <w:spacing w:line="480" w:lineRule="auto" w:before="0" w:after="0"/>
+        <w:spacing w:line="360" w:lineRule="auto" w:before="0" w:after="0"/>
         <w:jc w:val="both"/>
         <w:rPr>
           <w:rFonts w:ascii="Times New Roman" w:hAnsi="Times New Roman"/>
@@ -3307,7 +3307,7 @@
     <w:p>
       <w:pPr>
         <w:widowControl/>
-        <w:spacing w:line="480" w:lineRule="auto" w:before="0" w:after="0"/>
+        <w:spacing w:line="360" w:lineRule="auto" w:before="0" w:after="0"/>
         <w:jc w:val="both"/>
         <w:rPr>
           <w:rFonts w:ascii="Times New Roman" w:hAnsi="Times New Roman"/>
@@ -3329,7 +3329,7 @@
     <w:p>
       <w:pPr>
         <w:widowControl/>
-        <w:spacing w:line="480" w:lineRule="auto" w:before="200" w:after="80"/>
+        <w:spacing w:line="360" w:lineRule="auto" w:before="200" w:after="80"/>
         <w:jc w:val="left"/>
         <w:rPr>
           <w:rFonts w:ascii="Times New Roman" w:hAnsi="Times New Roman"/>
@@ -3358,7 +3358,7 @@
     <w:p>
       <w:pPr>
         <w:widowControl/>
-        <w:spacing w:line="480" w:lineRule="auto" w:before="120" w:after="0"/>
+        <w:spacing w:line="360" w:lineRule="auto" w:before="120" w:after="0"/>
         <w:jc w:val="both"/>
         <w:rPr>
           <w:rFonts w:ascii="Times New Roman" w:hAnsi="Times New Roman"/>
@@ -3380,7 +3380,7 @@
     <w:p>
       <w:pPr>
         <w:widowControl/>
-        <w:spacing w:line="480" w:lineRule="auto" w:before="120" w:after="0"/>
+        <w:spacing w:line="360" w:lineRule="auto" w:before="120" w:after="0"/>
         <w:jc w:val="both"/>
         <w:rPr>
           <w:rFonts w:ascii="Times New Roman" w:hAnsi="Times New Roman"/>
@@ -3407,7 +3407,7 @@
           <w:ilvl w:val="0"/>
           <w:numId w:val="5"/>
         </w:numPr>
-        <w:spacing w:line="480" w:lineRule="auto" w:before="0" w:after="0"/>
+        <w:spacing w:line="360" w:lineRule="auto" w:before="0" w:after="0"/>
         <w:ind w:left="720" w:hanging="360"/>
         <w:jc w:val="both"/>
         <w:rPr>
@@ -3446,7 +3446,7 @@
           <w:ilvl w:val="0"/>
           <w:numId w:val="5"/>
         </w:numPr>
-        <w:spacing w:line="480" w:lineRule="auto" w:before="0" w:after="0"/>
+        <w:spacing w:line="360" w:lineRule="auto" w:before="0" w:after="0"/>
         <w:ind w:left="720" w:hanging="360"/>
         <w:jc w:val="both"/>
         <w:rPr>
@@ -3480,7 +3480,7 @@
     <w:p>
       <w:pPr>
         <w:widowControl/>
-        <w:spacing w:line="480" w:lineRule="auto" w:before="120" w:after="120"/>
+        <w:spacing w:line="360" w:lineRule="auto" w:before="120" w:after="120"/>
         <w:jc w:val="center"/>
         <w:rPr>
           <w:rFonts w:ascii="Times New Roman" w:hAnsi="Times New Roman"/>
@@ -3519,7 +3519,7 @@
     <w:p>
       <w:pPr>
         <w:widowControl/>
-        <w:spacing w:line="480" w:lineRule="auto" w:before="0" w:after="0"/>
+        <w:spacing w:line="360" w:lineRule="auto" w:before="0" w:after="0"/>
         <w:jc w:val="both"/>
         <w:rPr>
           <w:rFonts w:ascii="Times New Roman" w:hAnsi="Times New Roman"/>
@@ -3546,7 +3546,7 @@
           <w:ilvl w:val="0"/>
           <w:numId w:val="5"/>
         </w:numPr>
-        <w:spacing w:line="480" w:lineRule="auto" w:before="0" w:after="0"/>
+        <w:spacing w:line="360" w:lineRule="auto" w:before="0" w:after="0"/>
         <w:ind w:left="720" w:hanging="360"/>
         <w:jc w:val="both"/>
         <w:rPr>
@@ -3580,7 +3580,7 @@
     <w:p>
       <w:pPr>
         <w:widowControl/>
-        <w:spacing w:line="480" w:lineRule="auto" w:before="200" w:after="80"/>
+        <w:spacing w:line="360" w:lineRule="auto" w:before="200" w:after="80"/>
         <w:jc w:val="left"/>
         <w:rPr>
           <w:rFonts w:ascii="Times New Roman" w:hAnsi="Times New Roman"/>
@@ -3609,7 +3609,7 @@
     <w:p>
       <w:pPr>
         <w:widowControl/>
-        <w:spacing w:line="480" w:lineRule="auto" w:before="120" w:after="0"/>
+        <w:spacing w:line="360" w:lineRule="auto" w:before="120" w:after="0"/>
         <w:jc w:val="both"/>
         <w:rPr>
           <w:rFonts w:ascii="Times New Roman" w:hAnsi="Times New Roman"/>
@@ -3636,7 +3636,7 @@
           <w:ilvl w:val="0"/>
           <w:numId w:val="6"/>
         </w:numPr>
-        <w:spacing w:line="480" w:lineRule="auto" w:before="0" w:after="0"/>
+        <w:spacing w:line="360" w:lineRule="auto" w:before="0" w:after="0"/>
         <w:ind w:left="720" w:hanging="360"/>
         <w:jc w:val="both"/>
         <w:rPr>
@@ -3675,7 +3675,7 @@
           <w:ilvl w:val="0"/>
           <w:numId w:val="6"/>
         </w:numPr>
-        <w:spacing w:line="480" w:lineRule="auto" w:before="0" w:after="0"/>
+        <w:spacing w:line="360" w:lineRule="auto" w:before="0" w:after="0"/>
         <w:ind w:left="720" w:hanging="360"/>
         <w:jc w:val="both"/>
         <w:rPr>
@@ -3714,7 +3714,7 @@
           <w:ilvl w:val="0"/>
           <w:numId w:val="6"/>
         </w:numPr>
-        <w:spacing w:line="480" w:lineRule="auto" w:before="0" w:after="0"/>
+        <w:spacing w:line="360" w:lineRule="auto" w:before="0" w:after="0"/>
         <w:ind w:left="720" w:hanging="360"/>
         <w:jc w:val="both"/>
         <w:rPr>
@@ -3753,7 +3753,7 @@
           <w:ilvl w:val="0"/>
           <w:numId w:val="6"/>
         </w:numPr>
-        <w:spacing w:line="480" w:lineRule="auto" w:before="0" w:after="0"/>
+        <w:spacing w:line="360" w:lineRule="auto" w:before="0" w:after="0"/>
         <w:ind w:left="720" w:hanging="360"/>
         <w:jc w:val="both"/>
         <w:rPr>
@@ -3776,7 +3776,7 @@
     <w:p>
       <w:pPr>
         <w:widowControl/>
-        <w:spacing w:line="480" w:lineRule="auto" w:before="200" w:after="80"/>
+        <w:spacing w:line="360" w:lineRule="auto" w:before="200" w:after="80"/>
         <w:jc w:val="left"/>
         <w:rPr>
           <w:rFonts w:ascii="Times New Roman" w:hAnsi="Times New Roman"/>
@@ -3805,7 +3805,7 @@
     <w:p>
       <w:pPr>
         <w:widowControl/>
-        <w:spacing w:line="480" w:lineRule="auto" w:before="160" w:after="40"/>
+        <w:spacing w:line="360" w:lineRule="auto" w:before="160" w:after="40"/>
         <w:jc w:val="left"/>
         <w:rPr>
           <w:rFonts w:ascii="Times New Roman" w:hAnsi="Times New Roman"/>
@@ -3830,7 +3830,7 @@
     <w:p>
       <w:pPr>
         <w:widowControl/>
-        <w:spacing w:line="480" w:lineRule="auto" w:before="0" w:after="0"/>
+        <w:spacing w:line="360" w:lineRule="auto" w:before="0" w:after="0"/>
         <w:jc w:val="both"/>
         <w:rPr>
           <w:rFonts w:ascii="Times New Roman" w:hAnsi="Times New Roman"/>
@@ -3850,7 +3850,7 @@
     <w:p>
       <w:pPr>
         <w:widowControl/>
-        <w:spacing w:line="480" w:lineRule="auto" w:before="160" w:after="40"/>
+        <w:spacing w:line="360" w:lineRule="auto" w:before="160" w:after="40"/>
         <w:jc w:val="left"/>
         <w:rPr>
           <w:rFonts w:ascii="Times New Roman" w:hAnsi="Times New Roman"/>
@@ -3875,7 +3875,7 @@
     <w:p>
       <w:pPr>
         <w:widowControl/>
-        <w:spacing w:line="480" w:lineRule="auto" w:before="0" w:after="0"/>
+        <w:spacing w:line="360" w:lineRule="auto" w:before="0" w:after="0"/>
         <w:jc w:val="both"/>
         <w:rPr>
           <w:rFonts w:ascii="Times New Roman" w:hAnsi="Times New Roman"/>
@@ -3895,7 +3895,7 @@
     <w:p>
       <w:pPr>
         <w:widowControl/>
-        <w:spacing w:line="480" w:lineRule="auto" w:before="160" w:after="40"/>
+        <w:spacing w:line="360" w:lineRule="auto" w:before="160" w:after="40"/>
         <w:jc w:val="left"/>
         <w:rPr>
           <w:rFonts w:ascii="Times New Roman" w:hAnsi="Times New Roman"/>
@@ -3920,7 +3920,7 @@
     <w:p>
       <w:pPr>
         <w:widowControl/>
-        <w:spacing w:line="480" w:lineRule="auto" w:before="0" w:after="0"/>
+        <w:spacing w:line="360" w:lineRule="auto" w:before="0" w:after="0"/>
         <w:jc w:val="both"/>
         <w:rPr>
           <w:rFonts w:ascii="Times New Roman" w:hAnsi="Times New Roman"/>
@@ -3940,7 +3940,7 @@
     <w:p>
       <w:pPr>
         <w:widowControl/>
-        <w:spacing w:line="480" w:lineRule="auto" w:before="160" w:after="40"/>
+        <w:spacing w:line="360" w:lineRule="auto" w:before="160" w:after="40"/>
         <w:jc w:val="left"/>
         <w:rPr>
           <w:rFonts w:ascii="Times New Roman" w:hAnsi="Times New Roman"/>
@@ -3965,7 +3965,7 @@
     <w:p>
       <w:pPr>
         <w:widowControl/>
-        <w:spacing w:line="480" w:lineRule="auto" w:before="0" w:after="0"/>
+        <w:spacing w:line="360" w:lineRule="auto" w:before="0" w:after="0"/>
         <w:jc w:val="both"/>
         <w:rPr>
           <w:rFonts w:ascii="Times New Roman" w:hAnsi="Times New Roman"/>
@@ -3985,7 +3985,7 @@
     <w:p>
       <w:pPr>
         <w:widowControl/>
-        <w:spacing w:line="480" w:lineRule="auto" w:before="160" w:after="40"/>
+        <w:spacing w:line="360" w:lineRule="auto" w:before="160" w:after="40"/>
         <w:jc w:val="left"/>
         <w:rPr>
           <w:rFonts w:ascii="Times New Roman" w:hAnsi="Times New Roman"/>
@@ -4010,7 +4010,7 @@
     <w:p>
       <w:pPr>
         <w:widowControl/>
-        <w:spacing w:line="480" w:lineRule="auto" w:before="0" w:after="0"/>
+        <w:spacing w:line="360" w:lineRule="auto" w:before="0" w:after="0"/>
         <w:jc w:val="both"/>
         <w:rPr>
           <w:rFonts w:ascii="Times New Roman" w:hAnsi="Times New Roman"/>
@@ -4030,7 +4030,7 @@
     <w:p>
       <w:pPr>
         <w:widowControl/>
-        <w:spacing w:line="480" w:lineRule="auto" w:before="160" w:after="40"/>
+        <w:spacing w:line="360" w:lineRule="auto" w:before="160" w:after="40"/>
         <w:jc w:val="left"/>
         <w:rPr>
           <w:rFonts w:ascii="Times New Roman" w:hAnsi="Times New Roman"/>
@@ -4055,7 +4055,7 @@
     <w:p>
       <w:pPr>
         <w:widowControl/>
-        <w:spacing w:line="480" w:lineRule="auto" w:before="0" w:after="0"/>
+        <w:spacing w:line="360" w:lineRule="auto" w:before="0" w:after="0"/>
         <w:jc w:val="both"/>
         <w:rPr>
           <w:rFonts w:ascii="Times New Roman" w:hAnsi="Times New Roman"/>
@@ -4075,7 +4075,7 @@
     <w:p>
       <w:pPr>
         <w:widowControl/>
-        <w:spacing w:line="480" w:lineRule="auto" w:before="160" w:after="40"/>
+        <w:spacing w:line="360" w:lineRule="auto" w:before="160" w:after="40"/>
         <w:jc w:val="left"/>
         <w:rPr>
           <w:rFonts w:ascii="Times New Roman" w:hAnsi="Times New Roman"/>
@@ -4100,7 +4100,7 @@
     <w:p>
       <w:pPr>
         <w:widowControl/>
-        <w:spacing w:line="480" w:lineRule="auto" w:before="0" w:after="0"/>
+        <w:spacing w:line="360" w:lineRule="auto" w:before="0" w:after="0"/>
         <w:jc w:val="both"/>
         <w:rPr>
           <w:rFonts w:ascii="Times New Roman" w:hAnsi="Times New Roman"/>
@@ -4120,7 +4120,7 @@
     <w:p>
       <w:pPr>
         <w:widowControl/>
-        <w:spacing w:line="480" w:lineRule="auto" w:before="240" w:after="120"/>
+        <w:spacing w:line="360" w:lineRule="auto" w:before="240" w:after="120"/>
         <w:jc w:val="left"/>
         <w:rPr>
           <w:rFonts w:ascii="Times New Roman" w:hAnsi="Times New Roman"/>
@@ -4144,7 +4144,7 @@
     <w:p>
       <w:pPr>
         <w:widowControl/>
-        <w:spacing w:line="480" w:lineRule="auto" w:before="200" w:after="80"/>
+        <w:spacing w:line="360" w:lineRule="auto" w:before="200" w:after="80"/>
         <w:jc w:val="left"/>
         <w:rPr>
           <w:rFonts w:ascii="Times New Roman" w:hAnsi="Times New Roman"/>
@@ -4172,7 +4172,7 @@
     <w:p>
       <w:pPr>
         <w:widowControl/>
-        <w:spacing w:line="480" w:lineRule="auto" w:before="0" w:after="0"/>
+        <w:spacing w:line="360" w:lineRule="auto" w:before="0" w:after="0"/>
         <w:jc w:val="both"/>
         <w:rPr>
           <w:rFonts w:ascii="Times New Roman" w:hAnsi="Times New Roman"/>
@@ -4208,7 +4208,7 @@
     <w:p>
       <w:pPr>
         <w:widowControl/>
-        <w:spacing w:line="480" w:lineRule="auto" w:before="200" w:after="80"/>
+        <w:spacing w:line="360" w:lineRule="auto" w:before="200" w:after="80"/>
         <w:jc w:val="left"/>
         <w:rPr>
           <w:rFonts w:ascii="Times New Roman" w:hAnsi="Times New Roman"/>
@@ -4236,7 +4236,7 @@
     <w:p>
       <w:pPr>
         <w:widowControl/>
-        <w:spacing w:line="480" w:lineRule="auto" w:before="0" w:after="0"/>
+        <w:spacing w:line="360" w:lineRule="auto" w:before="0" w:after="0"/>
         <w:jc w:val="both"/>
         <w:rPr>
           <w:rFonts w:ascii="Times New Roman" w:hAnsi="Times New Roman"/>
@@ -4264,7 +4264,7 @@
     <w:p>
       <w:pPr>
         <w:widowControl/>
-        <w:spacing w:line="480" w:lineRule="auto" w:before="200" w:after="80"/>
+        <w:spacing w:line="360" w:lineRule="auto" w:before="200" w:after="80"/>
         <w:jc w:val="left"/>
         <w:rPr>
           <w:rFonts w:ascii="Times New Roman" w:hAnsi="Times New Roman"/>
@@ -4292,7 +4292,7 @@
     <w:p>
       <w:pPr>
         <w:widowControl/>
-        <w:spacing w:line="480" w:lineRule="auto" w:before="0" w:after="0"/>
+        <w:spacing w:line="360" w:lineRule="auto" w:before="0" w:after="0"/>
         <w:jc w:val="both"/>
         <w:rPr>
           <w:rFonts w:ascii="Times New Roman" w:hAnsi="Times New Roman"/>
@@ -4344,7 +4344,7 @@
     <w:p>
       <w:pPr>
         <w:widowControl/>
-        <w:spacing w:line="480" w:lineRule="auto" w:before="200" w:after="80"/>
+        <w:spacing w:line="360" w:lineRule="auto" w:before="200" w:after="80"/>
         <w:jc w:val="left"/>
         <w:rPr>
           <w:rFonts w:ascii="Times New Roman" w:hAnsi="Times New Roman"/>
@@ -4372,7 +4372,7 @@
     <w:p>
       <w:pPr>
         <w:widowControl/>
-        <w:spacing w:line="480" w:lineRule="auto" w:before="0" w:after="0"/>
+        <w:spacing w:line="360" w:lineRule="auto" w:before="0" w:after="0"/>
         <w:jc w:val="both"/>
         <w:rPr>
           <w:rFonts w:ascii="Times New Roman" w:hAnsi="Times New Roman"/>
@@ -4432,7 +4432,7 @@
     <w:p>
       <w:pPr>
         <w:widowControl/>
-        <w:spacing w:line="480" w:lineRule="auto" w:before="0" w:after="0"/>
+        <w:spacing w:line="360" w:lineRule="auto" w:before="0" w:after="0"/>
         <w:jc w:val="both"/>
         <w:rPr>
           <w:rFonts w:ascii="Times New Roman" w:hAnsi="Times New Roman"/>
@@ -4471,7 +4471,7 @@
     <w:p>
       <w:pPr>
         <w:widowControl/>
-        <w:spacing w:line="480" w:lineRule="auto" w:before="200" w:after="80"/>
+        <w:spacing w:line="360" w:lineRule="auto" w:before="200" w:after="80"/>
         <w:jc w:val="left"/>
         <w:rPr>
           <w:rFonts w:ascii="Times New Roman" w:hAnsi="Times New Roman"/>
@@ -4499,7 +4499,7 @@
     <w:p>
       <w:pPr>
         <w:widowControl/>
-        <w:spacing w:line="480" w:lineRule="auto" w:before="0" w:after="0"/>
+        <w:spacing w:line="360" w:lineRule="auto" w:before="0" w:after="0"/>
         <w:jc w:val="both"/>
         <w:rPr>
           <w:rFonts w:ascii="Times New Roman" w:hAnsi="Times New Roman"/>
@@ -4527,7 +4527,7 @@
     <w:p>
       <w:pPr>
         <w:widowControl/>
-        <w:spacing w:line="480" w:lineRule="auto" w:before="200" w:after="80"/>
+        <w:spacing w:line="360" w:lineRule="auto" w:before="200" w:after="80"/>
         <w:jc w:val="left"/>
         <w:rPr>
           <w:rFonts w:ascii="Times New Roman" w:hAnsi="Times New Roman"/>
@@ -4555,7 +4555,7 @@
     <w:p>
       <w:pPr>
         <w:widowControl/>
-        <w:spacing w:line="480" w:lineRule="auto" w:before="0" w:after="0"/>
+        <w:spacing w:line="360" w:lineRule="auto" w:before="0" w:after="0"/>
         <w:jc w:val="both"/>
         <w:rPr>
           <w:rFonts w:ascii="Times New Roman" w:hAnsi="Times New Roman"/>
@@ -4575,7 +4575,7 @@
     <w:p>
       <w:pPr>
         <w:widowControl/>
-        <w:spacing w:line="480" w:lineRule="auto" w:before="200" w:after="80"/>
+        <w:spacing w:line="360" w:lineRule="auto" w:before="200" w:after="80"/>
         <w:jc w:val="left"/>
         <w:rPr>
           <w:rFonts w:ascii="Times New Roman" w:hAnsi="Times New Roman"/>
@@ -4603,7 +4603,7 @@
     <w:p>
       <w:pPr>
         <w:widowControl/>
-        <w:spacing w:line="480" w:lineRule="auto" w:before="0" w:after="0"/>
+        <w:spacing w:line="360" w:lineRule="auto" w:before="0" w:after="0"/>
         <w:jc w:val="both"/>
         <w:rPr>
           <w:rFonts w:ascii="Times New Roman" w:hAnsi="Times New Roman"/>
@@ -4623,7 +4623,7 @@
     <w:p>
       <w:pPr>
         <w:widowControl/>
-        <w:spacing w:line="480" w:lineRule="auto" w:before="240" w:after="120"/>
+        <w:spacing w:line="360" w:lineRule="auto" w:before="240" w:after="120"/>
         <w:jc w:val="left"/>
         <w:rPr>
           <w:rFonts w:ascii="Times New Roman" w:hAnsi="Times New Roman"/>
@@ -4647,7 +4647,7 @@
     <w:p>
       <w:pPr>
         <w:widowControl/>
-        <w:spacing w:line="480" w:lineRule="auto" w:before="0" w:after="0"/>
+        <w:spacing w:line="360" w:lineRule="auto" w:before="0" w:after="0"/>
         <w:jc w:val="both"/>
         <w:rPr>
           <w:rFonts w:ascii="Times New Roman" w:hAnsi="Times New Roman"/>
@@ -4707,7 +4707,7 @@
     <w:p>
       <w:pPr>
         <w:widowControl/>
-        <w:spacing w:line="480" w:lineRule="auto" w:before="0" w:after="0"/>
+        <w:spacing w:line="360" w:lineRule="auto" w:before="0" w:after="0"/>
         <w:jc w:val="both"/>
         <w:rPr>
           <w:rFonts w:ascii="Times New Roman" w:hAnsi="Times New Roman"/>
@@ -5532,7 +5532,7 @@
     <w:p>
       <w:pPr>
         <w:widowControl/>
-        <w:spacing w:line="480" w:lineRule="auto" w:before="0" w:after="0"/>
+        <w:spacing w:line="360" w:lineRule="auto" w:before="0" w:after="0"/>
         <w:jc w:val="both"/>
         <w:rPr>
           <w:rFonts w:ascii="Times New Roman" w:hAnsi="Times New Roman"/>
@@ -6118,7 +6118,7 @@
     <w:p>
       <w:pPr>
         <w:widowControl/>
-        <w:spacing w:line="480" w:lineRule="auto" w:before="0" w:after="0"/>
+        <w:spacing w:line="360" w:lineRule="auto" w:before="0" w:after="0"/>
         <w:jc w:val="both"/>
         <w:rPr>
           <w:rFonts w:ascii="Times New Roman" w:hAnsi="Times New Roman"/>
@@ -6307,7 +6307,7 @@
     <w:p>
       <w:pPr>
         <w:widowControl/>
-        <w:spacing w:line="480" w:lineRule="auto" w:before="0" w:after="0"/>
+        <w:spacing w:line="360" w:lineRule="auto" w:before="0" w:after="0"/>
         <w:jc w:val="both"/>
         <w:rPr>
           <w:rFonts w:ascii="Times New Roman" w:hAnsi="Times New Roman"/>
@@ -6562,7 +6562,7 @@
     <w:p>
       <w:pPr>
         <w:widowControl/>
-        <w:spacing w:line="480" w:lineRule="auto" w:before="0" w:after="0"/>
+        <w:spacing w:line="360" w:lineRule="auto" w:before="0" w:after="0"/>
         <w:jc w:val="both"/>
         <w:rPr>
           <w:rFonts w:ascii="Times New Roman" w:hAnsi="Times New Roman"/>
@@ -6957,7 +6957,7 @@
     <w:p>
       <w:pPr>
         <w:widowControl/>
-        <w:spacing w:line="480" w:lineRule="auto" w:before="0" w:after="0"/>
+        <w:spacing w:line="360" w:lineRule="auto" w:before="0" w:after="0"/>
         <w:jc w:val="both"/>
         <w:rPr>
           <w:rFonts w:ascii="Times New Roman" w:hAnsi="Times New Roman"/>
@@ -7225,7 +7225,7 @@
     <w:p>
       <w:pPr>
         <w:widowControl/>
-        <w:spacing w:line="480" w:lineRule="auto" w:before="0" w:after="0"/>
+        <w:spacing w:line="360" w:lineRule="auto" w:before="0" w:after="0"/>
         <w:jc w:val="both"/>
         <w:rPr>
           <w:rFonts w:ascii="Times New Roman" w:hAnsi="Times New Roman"/>
@@ -7633,7 +7633,7 @@
     <w:p>
       <w:pPr>
         <w:widowControl/>
-        <w:spacing w:line="480" w:lineRule="auto" w:before="0" w:after="0"/>
+        <w:spacing w:line="360" w:lineRule="auto" w:before="0" w:after="0"/>
         <w:jc w:val="both"/>
         <w:rPr>
           <w:rFonts w:ascii="Times New Roman" w:hAnsi="Times New Roman"/>
@@ -7982,7 +7982,7 @@
     <w:p>
       <w:pPr>
         <w:widowControl/>
-        <w:spacing w:line="480" w:lineRule="auto" w:before="240" w:after="120"/>
+        <w:spacing w:line="360" w:lineRule="auto" w:before="240" w:after="120"/>
         <w:jc w:val="left"/>
         <w:rPr>
           <w:rFonts w:ascii="Times New Roman" w:hAnsi="Times New Roman"/>
@@ -8009,7 +8009,7 @@
     <w:p>
       <w:pPr>
         <w:widowControl/>
-        <w:spacing w:line="480" w:lineRule="auto" w:before="0" w:after="0"/>
+        <w:spacing w:line="360" w:lineRule="auto" w:before="0" w:after="0"/>
         <w:jc w:val="both"/>
         <w:rPr>
           <w:rFonts w:ascii="Times New Roman" w:hAnsi="Times New Roman"/>
@@ -8029,7 +8029,7 @@
     <w:p>
       <w:pPr>
         <w:widowControl/>
-        <w:spacing w:line="480" w:lineRule="auto" w:before="0" w:after="0"/>
+        <w:spacing w:line="360" w:lineRule="auto" w:before="0" w:after="0"/>
         <w:jc w:val="both"/>
         <w:rPr>
           <w:rFonts w:ascii="Times New Roman" w:hAnsi="Times New Roman"/>
@@ -8058,7 +8058,7 @@
     <w:p>
       <w:pPr>
         <w:widowControl/>
-        <w:spacing w:line="480" w:lineRule="auto" w:before="0" w:after="0"/>
+        <w:spacing w:line="360" w:lineRule="auto" w:before="0" w:after="0"/>
         <w:jc w:val="both"/>
         <w:rPr>
           <w:rFonts w:ascii="Times New Roman" w:hAnsi="Times New Roman"/>
@@ -8087,7 +8087,7 @@
     <w:p>
       <w:pPr>
         <w:widowControl/>
-        <w:spacing w:line="480" w:lineRule="auto" w:before="0" w:after="0"/>
+        <w:spacing w:line="360" w:lineRule="auto" w:before="0" w:after="0"/>
         <w:jc w:val="both"/>
         <w:rPr>
           <w:rFonts w:ascii="Times New Roman" w:hAnsi="Times New Roman"/>
@@ -8116,7 +8116,7 @@
     <w:p>
       <w:pPr>
         <w:widowControl/>
-        <w:spacing w:line="480" w:lineRule="auto" w:before="0" w:after="0"/>
+        <w:spacing w:line="360" w:lineRule="auto" w:before="0" w:after="0"/>
         <w:jc w:val="both"/>
         <w:rPr>
           <w:rFonts w:ascii="Times New Roman" w:hAnsi="Times New Roman"/>
@@ -8145,7 +8145,7 @@
     <w:p>
       <w:pPr>
         <w:widowControl/>
-        <w:spacing w:line="480" w:lineRule="auto" w:before="240" w:after="120"/>
+        <w:spacing w:line="360" w:lineRule="auto" w:before="240" w:after="120"/>
         <w:jc w:val="left"/>
         <w:rPr>
           <w:rFonts w:ascii="Times New Roman" w:hAnsi="Times New Roman"/>
@@ -8172,7 +8172,7 @@
     <w:p>
       <w:pPr>
         <w:widowControl/>
-        <w:spacing w:line="480" w:lineRule="auto" w:before="0" w:after="0"/>
+        <w:spacing w:line="360" w:lineRule="auto" w:before="0" w:after="0"/>
         <w:jc w:val="both"/>
         <w:rPr>
           <w:rFonts w:ascii="Times New Roman" w:hAnsi="Times New Roman"/>
@@ -8194,7 +8194,7 @@
     <w:p>
       <w:pPr>
         <w:widowControl/>
-        <w:spacing w:line="480" w:lineRule="auto" w:before="0" w:after="0"/>
+        <w:spacing w:line="360" w:lineRule="auto" w:before="0" w:after="0"/>
         <w:jc w:val="both"/>
         <w:rPr>
           <w:rFonts w:ascii="Times New Roman" w:hAnsi="Times New Roman"/>
@@ -8216,7 +8216,7 @@
     <w:p>
       <w:pPr>
         <w:widowControl/>
-        <w:spacing w:line="480" w:lineRule="auto" w:before="0" w:after="0"/>
+        <w:spacing w:line="360" w:lineRule="auto" w:before="0" w:after="0"/>
         <w:jc w:val="both"/>
         <w:rPr>
           <w:rFonts w:ascii="Times New Roman" w:hAnsi="Times New Roman"/>
@@ -8238,7 +8238,7 @@
     <w:p>
       <w:pPr>
         <w:widowControl/>
-        <w:spacing w:line="480" w:lineRule="auto" w:before="0" w:after="0"/>
+        <w:spacing w:line="360" w:lineRule="auto" w:before="0" w:after="0"/>
         <w:jc w:val="both"/>
         <w:rPr>
           <w:rFonts w:ascii="Times New Roman" w:hAnsi="Times New Roman"/>
@@ -8260,7 +8260,7 @@
     <w:p>
       <w:pPr>
         <w:widowControl/>
-        <w:spacing w:line="480" w:lineRule="auto" w:before="0" w:after="0"/>
+        <w:spacing w:line="360" w:lineRule="auto" w:before="0" w:after="0"/>
         <w:jc w:val="both"/>
         <w:rPr>
           <w:rFonts w:ascii="Times New Roman" w:hAnsi="Times New Roman"/>
@@ -8282,7 +8282,7 @@
     <w:p>
       <w:pPr>
         <w:widowControl/>
-        <w:spacing w:line="480" w:lineRule="auto" w:before="0" w:after="0"/>
+        <w:spacing w:line="360" w:lineRule="auto" w:before="0" w:after="0"/>
         <w:jc w:val="both"/>
         <w:rPr>
           <w:rFonts w:ascii="Times New Roman" w:hAnsi="Times New Roman"/>
@@ -8837,7 +8837,7 @@
     <w:p>
       <w:pPr>
         <w:widowControl/>
-        <w:spacing w:line="480" w:lineRule="auto" w:before="240" w:after="120"/>
+        <w:spacing w:line="360" w:lineRule="auto" w:before="240" w:after="120"/>
         <w:jc w:val="left"/>
         <w:rPr>
           <w:rFonts w:ascii="Times New Roman" w:hAnsi="Times New Roman"/>
@@ -8861,7 +8861,7 @@
     <w:p>
       <w:pPr>
         <w:widowControl/>
-        <w:spacing w:line="480" w:lineRule="auto" w:before="0" w:after="0"/>
+        <w:spacing w:line="360" w:lineRule="auto" w:before="0" w:after="0"/>
         <w:jc w:val="both"/>
         <w:rPr>
           <w:rFonts w:ascii="Times New Roman" w:hAnsi="Times New Roman"/>
@@ -8881,7 +8881,7 @@
     <w:p>
       <w:pPr>
         <w:widowControl/>
-        <w:spacing w:line="480" w:lineRule="auto" w:before="0" w:after="0"/>
+        <w:spacing w:line="360" w:lineRule="auto" w:before="0" w:after="0"/>
         <w:jc w:val="both"/>
         <w:rPr>
           <w:rFonts w:ascii="Times New Roman" w:hAnsi="Times New Roman"/>
@@ -8901,7 +8901,7 @@
     <w:p>
       <w:pPr>
         <w:widowControl/>
-        <w:spacing w:line="480" w:lineRule="auto" w:before="0" w:after="0"/>
+        <w:spacing w:line="360" w:lineRule="auto" w:before="0" w:after="0"/>
         <w:jc w:val="both"/>
         <w:rPr>
           <w:rFonts w:ascii="Times New Roman" w:hAnsi="Times New Roman"/>
@@ -8921,7 +8921,7 @@
     <w:p>
       <w:pPr>
         <w:widowControl/>
-        <w:spacing w:line="480" w:lineRule="auto" w:before="240" w:after="120"/>
+        <w:spacing w:line="360" w:lineRule="auto" w:before="240" w:after="120"/>
         <w:jc w:val="left"/>
         <w:rPr>
           <w:rFonts w:ascii="Times New Roman" w:hAnsi="Times New Roman"/>
@@ -8948,7 +8948,7 @@
       <w:pPr>
         <w:pStyle w:val="EndNoteBibliography"/>
         <w:widowControl/>
-        <w:spacing w:line="240" w:lineRule="auto" w:before="0" w:after="120"/>
+        <w:spacing w:line="360" w:lineRule="auto" w:before="0" w:after="120"/>
         <w:ind w:left="720" w:hanging="720"/>
         <w:jc w:val="left"/>
         <w:rPr>
@@ -9013,7 +9013,7 @@
       <w:pPr>
         <w:pStyle w:val="EndNoteBibliography"/>
         <w:widowControl/>
-        <w:spacing w:line="240" w:lineRule="auto" w:before="0" w:after="120"/>
+        <w:spacing w:line="360" w:lineRule="auto" w:before="0" w:after="120"/>
         <w:ind w:left="720" w:hanging="720"/>
         <w:jc w:val="left"/>
         <w:rPr>
@@ -9048,7 +9048,7 @@
       <w:pPr>
         <w:pStyle w:val="EndNoteBibliography"/>
         <w:widowControl/>
-        <w:spacing w:line="240" w:lineRule="auto" w:before="0" w:after="120"/>
+        <w:spacing w:line="360" w:lineRule="auto" w:before="0" w:after="120"/>
         <w:ind w:left="720" w:hanging="720"/>
         <w:jc w:val="left"/>
         <w:rPr>
@@ -9083,7 +9083,7 @@
       <w:pPr>
         <w:pStyle w:val="EndNoteBibliography"/>
         <w:widowControl/>
-        <w:spacing w:line="240" w:lineRule="auto" w:before="0" w:after="120"/>
+        <w:spacing w:line="360" w:lineRule="auto" w:before="0" w:after="120"/>
         <w:ind w:left="720" w:hanging="720"/>
         <w:jc w:val="left"/>
         <w:rPr>
@@ -9118,7 +9118,7 @@
       <w:pPr>
         <w:pStyle w:val="EndNoteBibliography"/>
         <w:widowControl/>
-        <w:spacing w:line="240" w:lineRule="auto" w:before="0" w:after="120"/>
+        <w:spacing w:line="360" w:lineRule="auto" w:before="0" w:after="120"/>
         <w:ind w:left="720" w:hanging="720"/>
         <w:jc w:val="left"/>
         <w:rPr>
@@ -9153,7 +9153,7 @@
       <w:pPr>
         <w:pStyle w:val="EndNoteBibliography"/>
         <w:widowControl/>
-        <w:spacing w:line="240" w:lineRule="auto" w:before="0" w:after="120"/>
+        <w:spacing w:line="360" w:lineRule="auto" w:before="0" w:after="120"/>
         <w:ind w:left="720" w:hanging="720"/>
         <w:jc w:val="left"/>
         <w:rPr>
@@ -9188,7 +9188,7 @@
       <w:pPr>
         <w:pStyle w:val="EndNoteBibliography"/>
         <w:widowControl/>
-        <w:spacing w:line="240" w:lineRule="auto" w:before="0" w:after="120"/>
+        <w:spacing w:line="360" w:lineRule="auto" w:before="0" w:after="120"/>
         <w:ind w:left="720" w:hanging="720"/>
         <w:jc w:val="left"/>
         <w:rPr>
@@ -9223,7 +9223,7 @@
       <w:pPr>
         <w:pStyle w:val="EndNoteBibliography"/>
         <w:widowControl/>
-        <w:spacing w:line="240" w:lineRule="auto" w:before="0" w:after="120"/>
+        <w:spacing w:line="360" w:lineRule="auto" w:before="0" w:after="120"/>
         <w:ind w:left="720" w:hanging="720"/>
         <w:jc w:val="left"/>
         <w:rPr>
@@ -9258,7 +9258,7 @@
       <w:pPr>
         <w:pStyle w:val="EndNoteBibliography"/>
         <w:widowControl/>
-        <w:spacing w:line="240" w:lineRule="auto" w:before="0" w:after="120"/>
+        <w:spacing w:line="360" w:lineRule="auto" w:before="0" w:after="120"/>
         <w:ind w:left="720" w:hanging="720"/>
         <w:jc w:val="left"/>
         <w:rPr>
@@ -9293,7 +9293,7 @@
       <w:pPr>
         <w:pStyle w:val="EndNoteBibliography"/>
         <w:widowControl/>
-        <w:spacing w:line="240" w:lineRule="auto" w:before="0" w:after="120"/>
+        <w:spacing w:line="360" w:lineRule="auto" w:before="0" w:after="120"/>
         <w:ind w:left="720" w:hanging="720"/>
         <w:jc w:val="left"/>
         <w:rPr>
@@ -9328,7 +9328,7 @@
       <w:pPr>
         <w:pStyle w:val="EndNoteBibliography"/>
         <w:widowControl/>
-        <w:spacing w:line="240" w:lineRule="auto" w:before="0" w:after="120"/>
+        <w:spacing w:line="360" w:lineRule="auto" w:before="0" w:after="120"/>
         <w:ind w:left="720" w:hanging="720"/>
         <w:jc w:val="left"/>
         <w:rPr>
@@ -9363,7 +9363,7 @@
       <w:pPr>
         <w:pStyle w:val="EndNoteBibliography"/>
         <w:widowControl/>
-        <w:spacing w:line="240" w:lineRule="auto" w:before="0" w:after="120"/>
+        <w:spacing w:line="360" w:lineRule="auto" w:before="0" w:after="120"/>
         <w:ind w:left="720" w:hanging="720"/>
         <w:jc w:val="left"/>
         <w:rPr>
@@ -9398,7 +9398,7 @@
       <w:pPr>
         <w:pStyle w:val="EndNoteBibliography"/>
         <w:widowControl/>
-        <w:spacing w:line="240" w:lineRule="auto" w:before="0" w:after="120"/>
+        <w:spacing w:line="360" w:lineRule="auto" w:before="0" w:after="120"/>
         <w:ind w:left="720" w:hanging="720"/>
         <w:jc w:val="left"/>
         <w:rPr>
@@ -9433,7 +9433,7 @@
       <w:pPr>
         <w:pStyle w:val="EndNoteBibliography"/>
         <w:widowControl/>
-        <w:spacing w:line="240" w:lineRule="auto" w:before="0" w:after="120"/>
+        <w:spacing w:line="360" w:lineRule="auto" w:before="0" w:after="120"/>
         <w:ind w:left="720" w:hanging="720"/>
         <w:jc w:val="left"/>
         <w:rPr>
@@ -9468,7 +9468,7 @@
       <w:pPr>
         <w:pStyle w:val="EndNoteBibliography"/>
         <w:widowControl/>
-        <w:spacing w:line="240" w:lineRule="auto" w:before="0" w:after="120"/>
+        <w:spacing w:line="360" w:lineRule="auto" w:before="0" w:after="120"/>
         <w:ind w:left="720" w:hanging="720"/>
         <w:jc w:val="left"/>
         <w:rPr>
@@ -9503,7 +9503,7 @@
       <w:pPr>
         <w:pStyle w:val="EndNoteBibliography"/>
         <w:widowControl/>
-        <w:spacing w:line="240" w:lineRule="auto" w:before="0" w:after="120"/>
+        <w:spacing w:line="360" w:lineRule="auto" w:before="0" w:after="120"/>
         <w:ind w:left="720" w:hanging="720"/>
         <w:jc w:val="left"/>
         <w:rPr>
@@ -9538,7 +9538,7 @@
       <w:pPr>
         <w:pStyle w:val="EndNoteBibliography"/>
         <w:widowControl/>
-        <w:spacing w:line="240" w:lineRule="auto" w:before="0" w:after="120"/>
+        <w:spacing w:line="360" w:lineRule="auto" w:before="0" w:after="120"/>
         <w:ind w:left="720" w:hanging="720"/>
         <w:jc w:val="left"/>
         <w:rPr>
@@ -9573,7 +9573,7 @@
       <w:pPr>
         <w:pStyle w:val="EndNoteBibliography"/>
         <w:widowControl/>
-        <w:spacing w:line="240" w:lineRule="auto" w:before="0" w:after="120"/>
+        <w:spacing w:line="360" w:lineRule="auto" w:before="0" w:after="120"/>
         <w:ind w:left="720" w:hanging="720"/>
         <w:jc w:val="left"/>
         <w:rPr>
@@ -9608,7 +9608,7 @@
       <w:pPr>
         <w:pStyle w:val="EndNoteBibliography"/>
         <w:widowControl/>
-        <w:spacing w:line="240" w:lineRule="auto" w:before="0" w:after="120"/>
+        <w:spacing w:line="360" w:lineRule="auto" w:before="0" w:after="120"/>
         <w:ind w:left="720" w:hanging="720"/>
         <w:jc w:val="left"/>
         <w:rPr>
@@ -9643,7 +9643,7 @@
       <w:pPr>
         <w:pStyle w:val="EndNoteBibliography"/>
         <w:widowControl/>
-        <w:spacing w:line="240" w:lineRule="auto" w:before="0" w:after="120"/>
+        <w:spacing w:line="360" w:lineRule="auto" w:before="0" w:after="120"/>
         <w:ind w:left="720" w:hanging="720"/>
         <w:jc w:val="left"/>
         <w:rPr>
@@ -9678,7 +9678,7 @@
       <w:pPr>
         <w:pStyle w:val="EndNoteBibliography"/>
         <w:widowControl/>
-        <w:spacing w:line="240" w:lineRule="auto" w:before="0" w:after="120"/>
+        <w:spacing w:line="360" w:lineRule="auto" w:before="0" w:after="120"/>
         <w:ind w:left="720" w:hanging="720"/>
         <w:jc w:val="left"/>
         <w:rPr>
@@ -9713,7 +9713,7 @@
       <w:pPr>
         <w:pStyle w:val="EndNoteBibliography"/>
         <w:widowControl/>
-        <w:spacing w:line="240" w:lineRule="auto" w:before="0" w:after="120"/>
+        <w:spacing w:line="360" w:lineRule="auto" w:before="0" w:after="120"/>
         <w:ind w:left="720" w:hanging="720"/>
         <w:jc w:val="left"/>
         <w:rPr>
@@ -9748,7 +9748,7 @@
       <w:pPr>
         <w:pStyle w:val="EndNoteBibliography"/>
         <w:widowControl/>
-        <w:spacing w:line="240" w:lineRule="auto" w:before="0" w:after="120"/>
+        <w:spacing w:line="360" w:lineRule="auto" w:before="0" w:after="120"/>
         <w:ind w:left="720" w:hanging="720"/>
         <w:jc w:val="left"/>
         <w:rPr>
@@ -9783,7 +9783,7 @@
       <w:pPr>
         <w:pStyle w:val="EndNoteBibliography"/>
         <w:widowControl/>
-        <w:spacing w:line="240" w:lineRule="auto" w:before="0" w:after="120"/>
+        <w:spacing w:line="360" w:lineRule="auto" w:before="0" w:after="120"/>
         <w:ind w:left="720" w:hanging="720"/>
         <w:jc w:val="left"/>
         <w:rPr>
@@ -9818,7 +9818,7 @@
       <w:pPr>
         <w:pStyle w:val="EndNoteBibliography"/>
         <w:widowControl/>
-        <w:spacing w:line="240" w:lineRule="auto" w:before="0" w:after="120"/>
+        <w:spacing w:line="360" w:lineRule="auto" w:before="0" w:after="120"/>
         <w:ind w:left="720" w:hanging="720"/>
         <w:jc w:val="left"/>
         <w:rPr>
@@ -11163,7 +11163,7 @@
     <w:qFormat/>
     <w:rsid w:val="00C33597"/>
     <w:pPr>
-      <w:spacing w:after="0" w:line="480" w:lineRule="auto"/>
+      <w:spacing w:after="0" w:line="360" w:lineRule="auto"/>
     </w:pPr>
     <w:rPr>
       <w:rFonts w:ascii="Times New Roman" w:eastAsia="Times New Roman" w:hAnsi="Times New Roman" w:cs="Times New Roman"/>

</xml_diff>

<commit_message>
Remove duplicated study-design paragraph from the statistics section
Section 2.6.1 repeated Section 2.1 almost verbatim (only the ethics
approval sentence differed). Deleted the heading and its paragraph and
renumbered the remaining statistical subsections to 2.6.1-2.6.6.

Co-Authored-By: Claude Opus 5 <noreply@anthropic.com>
Claude-Session: https://claude.ai/code/session_01DwryMW8mt6PFkikMAku3sm
</commit_message>
<xml_diff>
--- a/main document-revised-4 eylul.docx
+++ b/main document-revised-4 eylul.docx
@@ -3824,7 +3824,7 @@
           <w:sz w:val="24"/>
           <w:szCs w:val="24"/>
         </w:rPr>
-        <w:t>2.6.1. Study Design and Data Sources</w:t>
+        <w:t>2.6.1. Descriptive Statistics and Group Comparisons</w:t>
       </w:r>
     </w:p>
     <w:p>
@@ -3844,7 +3844,7 @@
           <w:sz w:val="24"/>
           <w:szCs w:val="24"/>
         </w:rPr>
-        <w:t>This was a single-center retrospective observational study of adult patients who underwent minimal invasive cardiac surgery at Hacettepe University Hospital. The analysis was based on a convenience sample of all eligible cases identified in the institutional archive during the study window; no a priori sample size calculation was conducted. Eligible cases were stratified by anesthetic technique into two groups: target-controlled infusion (TCI, n=18) and total intravenous anesthesia with manually controlled infusion (TIVA, n=47). All patients received total intravenous anesthesia; no inhalational anesthetic agents were administered intraoperatively. The analytic framework was adapted from Bai et al. (Journal of Clinical Anesthesia, 2026), with modifications appropriate to the single-center cohort design and sample size.</w:t>
+        <w:t xml:space="preserve">Continuous variables were summarized as median [interquartile range, IQR] when their distribution deviated from normality, as assessed by the Shapiro–Wilk test, or as mean ± standard deviation (SD) when normality was supported. Categorical variables were reported as count (percentage). Between-group comparisons of continuous variables were performed using the Mann–Whitney U test as the default, given the predominance of right-skewed distributions among the outcome variables; Welch's t-test was used in the limited cases where both group distributions met the normality assumption. Effect sizes for continuous comparisons were reported as rank-biserial r, interpreted using Cohen's conventions (small ≈ 0.1, medium ≈ 0.3, large ≈ 0.5). For binary outcomes with clinical relevance, odds ratios with 95% confidence intervals were computed. Confidence intervals for between-group differences in median continuous outcomes were estimated via the bootstrap percentile method (5,000 replications). Categorical variables were compared using the chi-square test or Fisher's exact test when expected cell counts were below five. </w:t>
       </w:r>
     </w:p>
     <w:p>
@@ -3869,7 +3869,7 @@
           <w:sz w:val="24"/>
           <w:szCs w:val="24"/>
         </w:rPr>
-        <w:t>2.6.2. Descriptive Statistics and Group Comparisons</w:t>
+        <w:t>2.6.2. Multivariable Models</w:t>
       </w:r>
     </w:p>
     <w:p>
@@ -3889,7 +3889,7 @@
           <w:sz w:val="24"/>
           <w:szCs w:val="24"/>
         </w:rPr>
-        <w:t xml:space="preserve">Continuous variables were summarized as median [interquartile range, IQR] when their distribution deviated from normality, as assessed by the Shapiro–Wilk test, or as mean ± standard deviation (SD) when normality was supported. Categorical variables were reported as count (percentage). Between-group comparisons of continuous variables were performed using the Mann–Whitney U test as the default, given the predominance of right-skewed distributions among the outcome variables; Welch's t-test was used in the limited cases where both group distributions met the normality assumption. Effect sizes for continuous comparisons were reported as rank-biserial r, interpreted using Cohen's conventions (small ≈ 0.1, medium ≈ 0.3, large ≈ 0.5). For binary outcomes with clinical relevance, odds ratios with 95% confidence intervals were computed. Confidence intervals for between-group differences in median continuous outcomes were estimated via the bootstrap percentile method (5,000 replications). Categorical variables were compared using the chi-square test or Fisher's exact test when expected cell counts were below five. </w:t>
+        <w:t>Two multivariable linear regression models were prespecified to adjust for potential confounding. Model 1 estimated the association between anesthetic technique (TCI vs TIVA) and intensive care unit (ICU) length of stay, with age, ASA physical status, and cardiopulmonary bypass duration as covariates. The outcome was log-transformed to address right skewness. Model 2 used the same predictor set to estimate the association between anesthetic technique and time to extubation (also log-transformed). For each model, regression coefficients were reported with 95% confidence intervals, standardized beta coefficients, and two-sided p-values. Variance inflation factors were inspected to verify the absence of problematic multicollinearity (all VIF &lt; 1.2). Back-transformation of the TCI coefficient was used to express the adjusted percent difference in the original scale.</w:t>
       </w:r>
     </w:p>
     <w:p>
@@ -3914,7 +3914,7 @@
           <w:sz w:val="24"/>
           <w:szCs w:val="24"/>
         </w:rPr>
-        <w:t>2.6.3. Multivariable Models</w:t>
+        <w:t>2.6.3. Post-hoc Power Analysis</w:t>
       </w:r>
     </w:p>
     <w:p>
@@ -3934,7 +3934,7 @@
           <w:sz w:val="24"/>
           <w:szCs w:val="24"/>
         </w:rPr>
-        <w:t>Two multivariable linear regression models were prespecified to adjust for potential confounding. Model 1 estimated the association between anesthetic technique (TCI vs TIVA) and intensive care unit (ICU) length of stay, with age, ASA physical status, and cardiopulmonary bypass duration as covariates. The outcome was log-transformed to address right skewness. Model 2 used the same predictor set to estimate the association between anesthetic technique and time to extubation (also log-transformed). For each model, regression coefficients were reported with 95% confidence intervals, standardized beta coefficients, and two-sided p-values. Variance inflation factors were inspected to verify the absence of problematic multicollinearity (all VIF &lt; 1.2). Back-transformation of the TCI coefficient was used to express the adjusted percent difference in the original scale.</w:t>
+        <w:t>Although no a priori sample size calculation was performed (the analysis was constrained by the available archive), a post-hoc power analysis was conducted for the primary continuous outcome (time to extubation) using G*Power 3.1 (Faul et al., 2007). The Wilcoxon–Mann–Whitney test (two groups) was selected, with Cohen's d effect size of 0.81 derived from the observed group means and pooled standard deviation, the observed group sizes after pairwise missing handling (n = 18 and 46), a two-sided significance threshold of 0.05, and assumed normal parent distribution. Achieved power was 0.80, supporting the robustness of the primary inferential finding.</w:t>
       </w:r>
     </w:p>
     <w:p>
@@ -3959,7 +3959,7 @@
           <w:sz w:val="24"/>
           <w:szCs w:val="24"/>
         </w:rPr>
-        <w:t>2.6.4. Post-hoc Power Analysis</w:t>
+        <w:t>2.6.4. Multiple Comparison Adjustment</w:t>
       </w:r>
     </w:p>
     <w:p>
@@ -3979,7 +3979,7 @@
           <w:sz w:val="24"/>
           <w:szCs w:val="24"/>
         </w:rPr>
-        <w:t>Although no a priori sample size calculation was performed (the analysis was constrained by the available archive), a post-hoc power analysis was conducted for the primary continuous outcome (time to extubation) using G*Power 3.1 (Faul et al., 2007). The Wilcoxon–Mann–Whitney test (two groups) was selected, with Cohen's d effect size of 0.81 derived from the observed group means and pooled standard deviation, the observed group sizes after pairwise missing handling (n = 18 and 46), a two-sided significance threshold of 0.05, and assumed normal parent distribution. Achieved power was 0.80, supporting the robustness of the primary inferential finding.</w:t>
+        <w:t>For the family of intraoperative hemodynamic comparisons reported in Table 4 (16 individual tests across pre-CPB and post-CPB phases, encompassing mean MAP, VIM, ARV, AUC below 65 mmHg, mean HR, mean NIRS, mean CVP, and hypotension incidence), the Benjamini–Hochberg false discovery rate (FDR) procedure was applied to the family of raw two-sided p-values. Both unadjusted and FDR-adjusted p-values are reported in Table 4. This approach controls the expected proportion of false discoveries at the conventional 5% level while preserving statistical power more than the more conservative Bonferroni correction, and is consistent with current recommendations for hemodynamic studies involving multiple correlated indices.</w:t>
       </w:r>
     </w:p>
     <w:p>
@@ -4004,7 +4004,7 @@
           <w:sz w:val="24"/>
           <w:szCs w:val="24"/>
         </w:rPr>
-        <w:t>2.6.5. Multiple Comparison Adjustment</w:t>
+        <w:t>2.6.5. Sensitivity Analysis</w:t>
       </w:r>
     </w:p>
     <w:p>
@@ -4024,7 +4024,7 @@
           <w:sz w:val="24"/>
           <w:szCs w:val="24"/>
         </w:rPr>
-        <w:t>For the family of intraoperative hemodynamic comparisons reported in Table 4 (16 individual tests across pre-CPB and post-CPB phases, encompassing mean MAP, VIM, ARV, AUC below 65 mmHg, mean HR, mean NIRS, mean CVP, and hypotension incidence), the Benjamini–Hochberg false discovery rate (FDR) procedure was applied to the family of raw two-sided p-values. Both unadjusted and FDR-adjusted p-values are reported in Table 4. This approach controls the expected proportion of false discoveries at the conventional 5% level while preserving statistical power more than the more conservative Bonferroni correction, and is consistent with current recommendations for hemodynamic studies involving multiple correlated indices.</w:t>
+        <w:t>Because cardiopulmonary bypass duration emerged as a significant predictor in Model 1 (ICU length of stay), a formal test of effect-measure modification by CPB duration was performed. An interaction term (anesthetic technique × CPB duration) was added to the log-transformed regression models for both primary outcomes (time to extubation and ICU length of stay).</w:t>
       </w:r>
     </w:p>
     <w:p>
@@ -4049,52 +4049,7 @@
           <w:sz w:val="24"/>
           <w:szCs w:val="24"/>
         </w:rPr>
-        <w:t>2.6.6. Sensitivity Analysis</w:t>
-      </w:r>
-    </w:p>
-    <w:p>
-      <w:pPr>
-        <w:widowControl/>
-        <w:spacing w:line="360" w:lineRule="auto" w:before="0" w:after="0"/>
-        <w:jc w:val="both"/>
-        <w:rPr>
-          <w:rFonts w:ascii="Times New Roman" w:hAnsi="Times New Roman"/>
-          <w:sz w:val="24"/>
-          <w:szCs w:val="24"/>
-        </w:rPr>
-      </w:pPr>
-      <w:r>
-        <w:rPr>
-          <w:rFonts w:ascii="Times New Roman" w:hAnsi="Times New Roman" w:cs="Times New Roman" w:eastAsia="Times New Roman"/>
-          <w:sz w:val="24"/>
-          <w:szCs w:val="24"/>
-        </w:rPr>
-        <w:t>Because cardiopulmonary bypass duration emerged as a significant predictor in Model 1 (ICU length of stay), a formal test of effect-measure modification by CPB duration was performed. An interaction term (anesthetic technique × CPB duration) was added to the log-transformed regression models for both primary outcomes (time to extubation and ICU length of stay).</w:t>
-      </w:r>
-    </w:p>
-    <w:p>
-      <w:pPr>
-        <w:widowControl/>
-        <w:spacing w:line="360" w:lineRule="auto" w:before="160" w:after="40"/>
-        <w:jc w:val="left"/>
-        <w:rPr>
-          <w:rFonts w:ascii="Times New Roman" w:hAnsi="Times New Roman"/>
-          <w:sz w:val="24"/>
-          <w:szCs w:val="24"/>
-        </w:rPr>
-        <w:keepNext/>
-        <w:keepLines/>
-      </w:pPr>
-      <w:r>
-        <w:rPr>
-          <w:rFonts w:ascii="Times New Roman" w:hAnsi="Times New Roman" w:cs="Times New Roman" w:eastAsia="Times New Roman"/>
-          <w:b w:val="0"/>
-          <w:bCs/>
-          <w:i/>
-          <w:sz w:val="24"/>
-          <w:szCs w:val="24"/>
-        </w:rPr>
-        <w:t>2.6.7. Software and Significance</w:t>
+        <w:t>2.6.6. Software and Significance</w:t>
       </w:r>
     </w:p>
     <w:p>

</xml_diff>